<commit_message>
Refocus the writing plan on repeat niche clients
Define blueprint and retainer in plain terms, and make supply-chain climate software the practice. Carbon accounting stays the lead topic. Real-asset work stays a first client.

Co-authored-by: nicolasmpicard-gif <nicolasmpicard-gif@users.noreply.github.com>
</commit_message>
<xml_diff>
--- a/Nicolas-Picard-Domain-Writing-Plan.docx
+++ b/Nicolas-Picard-Domain-Writing-Plan.docx
@@ -100,7 +100,7 @@
           <w:color w:val="1A1A1A"/>
           <w:sz w:val="20"/>
         </w:rPr>
-        <w:t>one retainer plus one blueprint, or two retainers. Ten to twelve writing days a month is the cap; the other days are for outreach, revisions, and the rest of your life. Months one and two will miss €2,500 net. Dialectica calls, a paid AstroFinance package, and cash you already have cover that gap. Judge the year on the run-rate you hold from month six, and pull this calendar forward if the master’s starts before October 2027.</w:t>
+        <w:t>two monthly retainers inside one niche. A blueprint is a single document, and the job ends. A retainer is the same client, the same fee, every month. Ten to twelve writing days a month is the cap. AstroFinance and Dialectica can pay while the niche is forming. Judge the year on whether two supply-chain climate clients have hired you more than once. Pull the calendar forward if the master’s starts before October 2027.</w:t>
       </w:r>
     </w:p>
     <w:p>
@@ -171,7 +171,7 @@
           <w:color w:val="1A1A1A"/>
           <w:sz w:val="20"/>
         </w:rPr>
-        <w:t>“I write the explainers, solution briefs, and litepapers that climate, supply-chain, and real-asset teams use to sell and implement complex products.” The seven CV variants stay in the job-search folder. Clients hire the sentence, and they will check it on nicolaspicard.carrd.co.</w:t>
+        <w:t>“I write the explainers and implementation pieces that supply-chain climate software teams use to sell and roll out their products.” The seven CV variants stay in the job-search folder. Clients hire the sentence, and they will check it on nicolaspicard.carrd.co.</w:t>
       </w:r>
     </w:p>
     <w:p>
@@ -190,7 +190,7 @@
           <w:color w:val="1B3A2F"/>
           <w:sz w:val="24"/>
         </w:rPr>
-        <w:t>3.  Three lanes, in the order to work them</w:t>
+        <w:t>3.  One niche, and what sits beside it</w:t>
       </w:r>
     </w:p>
     <w:p>
@@ -216,7 +216,7 @@
           <w:color w:val="1A1A1A"/>
           <w:sz w:val="20"/>
         </w:rPr>
-        <w:t xml:space="preserve">1. Supply-chain climate compliance and carbon accounting. </w:t>
+        <w:t xml:space="preserve">The niche is supply-chain climate software. </w:t>
       </w:r>
       <w:r>
         <w:rPr>
@@ -226,7 +226,7 @@
           <w:color w:val="1A1A1A"/>
           <w:sz w:val="20"/>
         </w:rPr>
-        <w:t>Highest potential, and the lane the roundtable opens. You have shipped the unglamorous part: traceability with Nespresso in DR Congo, a carbon feature for users across eight regions, CBAM-related upstream gaps, multi-tier supplier action, and current expert calls on which ESG platform fits which use case. Buyers are climate and supply-chain software firms (Berlin is full of them: Plan A, Cozero, Climatiq, Vaayu, carbmee, and their EU peers) and the sustainability leads who must explain this to procurement. Write as the person who sat with operators and specified the product. Emissions factors, audit opinions, and legal conclusions stay with the client’s specialists. Your name on a piece means the workflow is right.</w:t>
+        <w:t>This is the repeat business. Vendors that sell supplier compliance, traceability, and carbon data need a new explainer whenever the rule or the product moves, which is often. Your long proof is here: Nespresso traceability in DR Congo, OpenSC playbooks, IntegrityNext’s supplier tool and carbon feature, and Dialectica calls on which ESG platform fits which use case. Buyers are those vendors and the sustainability leads who explain them to procurement. Berlin examples include Plan A, Cozero, Climatiq, Vaayu, and carbmee.</w:t>
       </w:r>
     </w:p>
     <w:p>
@@ -252,7 +252,7 @@
           <w:color w:val="1A1A1A"/>
           <w:sz w:val="20"/>
         </w:rPr>
-        <w:t xml:space="preserve">2. Real-asset finance narratives. </w:t>
+        <w:t xml:space="preserve">Carbon accounting is the front door of that niche. </w:t>
       </w:r>
       <w:r>
         <w:rPr>
@@ -262,7 +262,7 @@
           <w:color w:val="1A1A1A"/>
           <w:sz w:val="20"/>
         </w:rPr>
-        <w:t>Fastest cash, thinner market. AstroFinance can commission you now, and Tesseract Academy (Stylianos and Linas Stankevicius) has already seen your standard on the litepaper. Stay on how a real asset is structured, explained, and implemented: aerospace, infrastructure, climate-related assets. The client’s counsel reviews anything that touches token structure. A one-line footer states that the piece is a product explanation, and that investment and securities advice sit with regulated advisors.</w:t>
+        <w:t>Lead with it. The roundtable, the search demand, and the IntegrityNext feature make it the topic a content lead already understands. The pieces you can repeat are workflow pieces: missing supplier data, CBAM upstream gaps, what the screen has to show, how a rollout goes. A practice that explains GHG Protocol chapters for a living is a weaker fit, because those clients will ask you to be the accountant. Emissions factors, audits, and legal conclusions stay with their specialists.</w:t>
       </w:r>
     </w:p>
     <w:p>
@@ -288,7 +288,7 @@
           <w:color w:val="1A1A1A"/>
           <w:sz w:val="20"/>
         </w:rPr>
-        <w:t xml:space="preserve">3. B2B solution and implementation writing, English and French. </w:t>
+        <w:t xml:space="preserve">Real-asset finance is a client. </w:t>
       </w:r>
       <w:r>
         <w:rPr>
@@ -298,7 +298,43 @@
           <w:color w:val="1A1A1A"/>
           <w:sz w:val="20"/>
         </w:rPr>
-        <w:t>The craft under the other two, and the one content teams cannot fake. Oracle scoping, RFP responses, onboarding playbooks, QBRs, a RACI rollout. Sell it as the document an account executive sends, or the playbook an implementation lead runs. French is a premium when an EU vendor asks; it is priced as its own delivery, at about 25% above the English fee. German is for coffees in Berlin.</w:t>
+        <w:t>Take the AstroFinance package. It pays, and it becomes a sample. Have the one conversation with Tesseract Academy, since Stylianos and Linas Stankevicius already know the litepaper. Then stop hunting that market. A company buys a litepaper once, the buyer pool is small, and the work follows crypto sentiment. If a second real-asset project would crowd out a supply-chain climate retainer, decline it. Counsel reviews anything on token structure, and the footer says the piece is a product explanation.</w:t>
+      </w:r>
+    </w:p>
+    <w:p>
+      <w:pPr>
+        <w:spacing w:before="0" w:after="40" w:line="245" w:lineRule="auto"/>
+        <w:ind w:left="198" w:hanging="198"/>
+      </w:pPr>
+      <w:r>
+        <w:rPr>
+          <w:rFonts w:ascii="Calibri" w:hAnsi="Calibri" w:eastAsia="Calibri"/>
+          <w:b/>
+          <w:i w:val="0"/>
+          <w:color w:val="2D6A4F"/>
+          <w:sz w:val="20"/>
+        </w:rPr>
+        <w:t xml:space="preserve">•  </w:t>
+      </w:r>
+      <w:r>
+        <w:rPr>
+          <w:rFonts w:ascii="Calibri" w:hAnsi="Calibri" w:eastAsia="Calibri"/>
+          <w:b/>
+          <w:i w:val="0"/>
+          <w:color w:val="1A1A1A"/>
+          <w:sz w:val="20"/>
+        </w:rPr>
+        <w:t xml:space="preserve">English and French are the craft inside the niche. </w:t>
+      </w:r>
+      <w:r>
+        <w:rPr>
+          <w:rFonts w:ascii="Calibri" w:hAnsi="Calibri" w:eastAsia="Calibri"/>
+          <w:b w:val="0"/>
+          <w:i w:val="0"/>
+          <w:color w:val="1A1A1A"/>
+          <w:sz w:val="20"/>
+        </w:rPr>
+        <w:t>Oracle scoping, RFP responses, onboarding playbooks, QBRs, a RACI rollout. Sell the document an account executive sends, or the playbook an implementation lead runs. French is its own delivery, at about 25% above the English fee, when an EU vendor asks. German is for coffees in Berlin.</w:t>
       </w:r>
     </w:p>
     <w:p>
@@ -314,7 +350,7 @@
           <w:color w:val="1A1A1A"/>
           <w:sz w:val="20"/>
         </w:rPr>
-        <w:t>AI belongs inside lane 1 as the roundtable subject, and as the tool you draft with. A general “AI writer” shop is a crowded, lower-paid market. Leave it closed.</w:t>
+        <w:t>AI is the roundtable subject inside carbon accounting, and the tool you draft with. A general AI-writing offer stays closed.</w:t>
       </w:r>
     </w:p>
     <w:p>
@@ -877,7 +913,7 @@
           <w:color w:val="1A1A1A"/>
           <w:sz w:val="20"/>
         </w:rPr>
-        <w:t xml:space="preserve">The month, in combinations. </w:t>
+        <w:t xml:space="preserve">What the words mean. </w:t>
       </w:r>
       <w:r>
         <w:rPr>
@@ -887,7 +923,7 @@
           <w:color w:val="1A1A1A"/>
           <w:sz w:val="20"/>
         </w:rPr>
-        <w:t>Retainer at €2,600 plus one blueprint at €2,800. Or two retainers. Or, while the retainer is still forming: AstroFinance’s package plus two outside briefs plus one expert-network month. Sell a retainer after one paid project with that client. AstroFinance is the exception, because the relationship is already there.</w:t>
+        <w:t>A blueprint is one document, then the engagement ends: 6–12 pages on how a product solves a problem or how a rollout works. Your litepaper sections and deal blueprints are this format. It wins a first yes and leaves a sample. A retainer is the practice you are trying to build: the same client pays the same fee every month, for three months at a minimum, for an agreed set of pieces. You interview them once a month and write from that. Two retainers in the niche are the stable shape. Sell a retainer after one paid project with that client. The AstroFinance package is ramp income, and it does not get a standing claim on the calendar.</w:t>
       </w:r>
     </w:p>
     <w:p>
@@ -1400,7 +1436,7 @@
                 <w:color w:val="1A1A1A"/>
                 <w:sz w:val="16"/>
               </w:rPr>
-              <w:t>Two warm asks first. Tesseract: you wrote AstroFinance’s product and strategy sections, you are taking a few litepaper commissions, where do their clients get stuck, and do they subcontract. AstroFinance: the €2,100 package with topics and price in the same note. Then a list of 40: 15 climate SaaS content leads, 10 compliance vendors, 8 real-asset studios, 7 implementation firms. Eight personal notes a week. Each note names a page on their site and proposes one title.</w:t>
+              <w:t>Two warm asks, then the niche list. AstroFinance: the €2,100 package, topics and price in the same note. Tesseract: one note about subcontracted litepaper sections, then stop. The list of 40 is supply-chain climate and compliance firms only: content leads and founders. Eight personal notes a week. Each note names a page on their site and proposes one title.</w:t>
             </w:r>
           </w:p>
         </w:tc>
@@ -1429,7 +1465,7 @@
                 <w:color w:val="1A1A1A"/>
                 <w:sz w:val="16"/>
               </w:rPr>
-              <w:t>AstroFinance has said yes or no. Two intro calls are booked.</w:t>
+              <w:t>AstroFinance has said yes or no. Two niche intro calls are booked.</w:t>
             </w:r>
           </w:p>
         </w:tc>
@@ -1588,7 +1624,7 @@
                 <w:color w:val="1A1A1A"/>
                 <w:sz w:val="16"/>
               </w:rPr>
-              <w:t>Convert the first happy client into a three-month retainer. The paid piece, with permission, becomes sample four. Lift the brief floor to €1,100 once two paid clips exist. Invoice about €2,000, then €3,500, then €5,200. Decline work under €800.</w:t>
+              <w:t>Convert the first niche client into a three-month retainer. A second real-asset project waits if it would fill days you need for that pursuit. The paid piece, with permission, becomes sample four. Lift the brief floor to €1,100 once two paid clips exist. Decline work under €800.</w:t>
             </w:r>
           </w:p>
         </w:tc>
@@ -1617,7 +1653,7 @@
                 <w:color w:val="1A1A1A"/>
                 <w:sz w:val="16"/>
               </w:rPr>
-              <w:t>A €5,200 invoiced month.</w:t>
+              <w:t>One supply-chain climate retainer is signed.</w:t>
             </w:r>
           </w:p>
         </w:tc>
@@ -1680,7 +1716,7 @@
                 <w:color w:val="1A1A1A"/>
                 <w:sz w:val="16"/>
               </w:rPr>
-              <w:t>Hold two anchors. One public piece a quarter, always in a lane. In month 9, write the degree-time offer on a single page: one retainer, about four days a month, €2,200–2,500, calendar told to the client in advance. Therapy marketing is a separate name and a separate site. This practice stays on climate, supply chain, and real assets, and it is the one you reopen after the degree.</w:t>
+              <w:t>Hold two niche retainers. One public piece a quarter, on supplier carbon, traceability, or compliance rollout. In month 9, write the degree-time offer on a single page: one retainer, about four days a month, €2,200–2,500, calendar told to the client in advance. Therapy marketing is a separate name and a separate site. This practice stays on supply-chain climate software, and it is the one you reopen after the degree.</w:t>
             </w:r>
           </w:p>
         </w:tc>
@@ -1844,7 +1880,7 @@
           <w:color w:val="1A1A1A"/>
           <w:sz w:val="20"/>
         </w:rPr>
-        <w:t>Climate and supply-chain products, real-asset narratives, French and English as the languages you write in, part-time from Berlin. Set German and Spanish to the level on your CVs, and keep them off the list of delivery languages. If the community role is still active, one clause is enough, and it does not lead.</w:t>
+        <w:t>Supply-chain climate software, French and English as the languages you write in, part-time from Berlin. AstroFinance can appear as proof. It does not lead the page. Set German and Spanish to the level on your CVs, and keep them off the list of delivery languages. If the community role is still active, one clause is enough, and it does not lead.</w:t>
       </w:r>
     </w:p>
     <w:p>

</xml_diff>

<commit_message>
Make practitioner white papers the lead offer
Internal explainers and implementation docs stay with the client's own team. The freelance offer is the white paper, with a monthly retainer so the next paper is repeat business.

Co-authored-by: nicolasmpicard-gif <nicolasmpicard-gif@users.noreply.github.com>
</commit_message>
<xml_diff>
--- a/Nicolas-Picard-Domain-Writing-Plan.docx
+++ b/Nicolas-Picard-Domain-Writing-Plan.docx
@@ -100,7 +100,7 @@
           <w:color w:val="1A1A1A"/>
           <w:sz w:val="20"/>
         </w:rPr>
-        <w:t>two monthly retainers inside one niche. A blueprint is a single document, and the job ends. A retainer is the same client, the same fee, every month. Ten to twelve writing days a month is the cap. AstroFinance and Dialectica can pay while the niche is forming. Judge the year on whether two supply-chain climate clients have hired you more than once. Pull the calendar forward if the master’s starts before October 2027.</w:t>
+        <w:t>two paper retainers inside one niche. A white paper is a single sales asset, and that project ends. A paper retainer is the same client, the same monthly fee, funding one paper a quarter plus a short briefing each month. Ten to twelve writing days a month is the cap. AstroFinance and Dialectica can pay while the niche is forming. Judge the year on whether two supply-chain climate clients have hired you for a second paper. Pull the calendar forward if the master’s starts before October 2027.</w:t>
       </w:r>
     </w:p>
     <w:p>
@@ -171,7 +171,7 @@
           <w:color w:val="1A1A1A"/>
           <w:sz w:val="20"/>
         </w:rPr>
-        <w:t>“I write the explainers and implementation pieces that supply-chain climate software teams use to sell and roll out their products.” The seven CV variants stay in the job-search folder. Clients hire the sentence, and they will check it on nicolaspicard.carrd.co.</w:t>
+        <w:t>“I write practitioner white papers for supply-chain climate software teams.” The seven CV variants stay in the job-search folder. Clients hire the sentence, and they will check it on nicolaspicard.carrd.co.</w:t>
       </w:r>
     </w:p>
     <w:p>
@@ -226,7 +226,7 @@
           <w:color w:val="1A1A1A"/>
           <w:sz w:val="20"/>
         </w:rPr>
-        <w:t>This is the repeat business. Vendors that sell supplier compliance, traceability, and carbon data need a new explainer whenever the rule or the product moves, which is often. Your long proof is here: Nespresso traceability in DR Congo, OpenSC playbooks, IntegrityNext’s supplier tool and carbon feature, and Dialectica calls on which ESG platform fits which use case. Buyers are those vendors and the sustainability leads who explain them to procurement. Berlin examples include Plan A, Cozero, Climatiq, Vaayu, and carbmee.</w:t>
+        <w:t>Vendors that sell supplier compliance, traceability, and carbon data are the buyers. Your long proof is here: Nespresso traceability in DR Congo, OpenSC playbooks, IntegrityNext’s supplier tool and carbon feature, and Dialectica calls on which ESG platform fits which use case. The person who hires you is product marketing or the founder, not the implementation team. Berlin examples include Plan A, Cozero, Climatiq, Vaayu, and carbmee.</w:t>
       </w:r>
     </w:p>
     <w:p>
@@ -262,7 +262,7 @@
           <w:color w:val="1A1A1A"/>
           <w:sz w:val="20"/>
         </w:rPr>
-        <w:t>Lead with it. The roundtable, the search demand, and the IntegrityNext feature make it the topic a content lead already understands. The pieces you can repeat are workflow pieces: missing supplier data, CBAM upstream gaps, what the screen has to show, how a rollout goes. A practice that explains GHG Protocol chapters for a living is a weaker fit, because those clients will ask you to be the accountant. Emissions factors, audits, and legal conclusions stay with their specialists.</w:t>
+        <w:t>Lead with it in the title of the paper. The roundtable, the search demand, and the IntegrityNext feature make it the topic a marketing lead already understands. The paper itself is about the workflow: missing supplier data, CBAM upstream gaps, what the product has to show a buyer. A practice that explains GHG Protocol chapters for a living is a weaker fit, because those clients will ask you to be the accountant. Emissions factors, audits, and legal conclusions stay with their specialists.</w:t>
       </w:r>
     </w:p>
     <w:p>
@@ -334,7 +334,7 @@
           <w:color w:val="1A1A1A"/>
           <w:sz w:val="20"/>
         </w:rPr>
-        <w:t>Oracle scoping, RFP responses, onboarding playbooks, QBRs, a RACI rollout. Sell the document an account executive sends, or the playbook an implementation lead runs. French is its own delivery, at about 25% above the English fee, when an EU vendor asks. German is for coffees in Berlin.</w:t>
+        <w:t>The paper an account executive can send. French is its own delivery, at about 25% above the English fee, when an EU vendor asks. German is for coffees in Berlin.</w:t>
       </w:r>
     </w:p>
     <w:p>
@@ -350,7 +350,7 @@
           <w:color w:val="1A1A1A"/>
           <w:sz w:val="20"/>
         </w:rPr>
-        <w:t>AI is the roundtable subject inside carbon accounting, and the tool you draft with. A general AI-writing offer stays closed.</w:t>
+        <w:t>Help-center articles, release notes, onboarding emails, and internal implementation docs are written by marketing, product, or customer success. Leave that work to them. The document they pay an outsider for is the white paper: long enough that a generalist marketer will not draft it, and specific enough that the founder will not sit down for it. Your litepaper sections are the proof. AI is the roundtable subject inside the paper, and the tool you draft with. A general AI-writing offer stays closed.</w:t>
       </w:r>
     </w:p>
     <w:p>
@@ -560,7 +560,7 @@
                 <w:color w:val="1A1A1A"/>
                 <w:sz w:val="16"/>
               </w:rPr>
-              <w:t>Expert brief</w:t>
+              <w:t>White paper</w:t>
             </w:r>
           </w:p>
         </w:tc>
@@ -589,7 +589,7 @@
                 <w:color w:val="1A1A1A"/>
                 <w:sz w:val="16"/>
               </w:rPr>
-              <w:t>1,200–1,800 words: a regulatory explainer, a rollout story, or one SEO piece with a single search intent. Two revision rounds.</w:t>
+              <w:t>2,500–4,000 words, one argument, one or two interviews with their expert. A sales asset, not a help article. They supply the expert and the legal review. Two revision rounds.</w:t>
             </w:r>
           </w:p>
         </w:tc>
@@ -618,7 +618,7 @@
                 <w:color w:val="1A1A1A"/>
                 <w:sz w:val="16"/>
               </w:rPr>
-              <w:t>€900–1,400</w:t>
+              <w:t>€3,500–6,000</w:t>
             </w:r>
           </w:p>
         </w:tc>
@@ -647,7 +647,7 @@
                 <w:color w:val="1A1A1A"/>
                 <w:sz w:val="16"/>
               </w:rPr>
-              <w:t>1–1.5 days</w:t>
+              <w:t>5–8 days</w:t>
             </w:r>
           </w:p>
         </w:tc>
@@ -681,7 +681,7 @@
                 <w:color w:val="1A1A1A"/>
                 <w:sz w:val="16"/>
               </w:rPr>
-              <w:t>Blueprint</w:t>
+              <w:t>Briefing</w:t>
             </w:r>
           </w:p>
         </w:tc>
@@ -710,7 +710,7 @@
                 <w:color w:val="1A1A1A"/>
                 <w:sz w:val="16"/>
               </w:rPr>
-              <w:t>6–12 pages: solution brief, implementation or deal blueprint, or the product and strategy half of a litepaper. Client supplies experts, data, and legal review.</w:t>
+              <w:t>800–1,200 words cut from the same research: one chapter, one regulatory point, or the public essay that points at the paper.</w:t>
             </w:r>
           </w:p>
         </w:tc>
@@ -739,7 +739,7 @@
                 <w:color w:val="1A1A1A"/>
                 <w:sz w:val="16"/>
               </w:rPr>
-              <w:t>€2,500–4,500</w:t>
+              <w:t>€700–1,100</w:t>
             </w:r>
           </w:p>
         </w:tc>
@@ -768,7 +768,7 @@
                 <w:color w:val="1A1A1A"/>
                 <w:sz w:val="16"/>
               </w:rPr>
-              <w:t>4–7 days</w:t>
+              <w:t>About 1 day</w:t>
             </w:r>
           </w:p>
         </w:tc>
@@ -802,7 +802,7 @@
                 <w:color w:val="1A1A1A"/>
                 <w:sz w:val="16"/>
               </w:rPr>
-              <w:t>Retainer</w:t>
+              <w:t>Paper retainer</w:t>
             </w:r>
           </w:p>
         </w:tc>
@@ -831,7 +831,7 @@
                 <w:color w:val="1A1A1A"/>
                 <w:sz w:val="16"/>
               </w:rPr>
-              <w:t>Three-month minimum. Monthly interview, then one blueprint or two briefs, plus four LinkedIn posts from the same material.</w:t>
+              <w:t>Billed monthly. One white paper a quarter, plus one briefing a month from the same interviews. Six-month start is ideal; three months is the minimum.</w:t>
             </w:r>
           </w:p>
         </w:tc>
@@ -860,7 +860,7 @@
                 <w:color w:val="1A1A1A"/>
                 <w:sz w:val="16"/>
               </w:rPr>
-              <w:t>€2,400–3,000 / month</w:t>
+              <w:t>€2,200–2,800 / month</w:t>
             </w:r>
           </w:p>
         </w:tc>
@@ -923,7 +923,7 @@
           <w:color w:val="1A1A1A"/>
           <w:sz w:val="20"/>
         </w:rPr>
-        <w:t>A blueprint is one document, then the engagement ends: 6–12 pages on how a product solves a problem or how a rollout works. Your litepaper sections and deal blueprints are this format. It wins a first yes and leaves a sample. A retainer is the practice you are trying to build: the same client pays the same fee every month, for three months at a minimum, for an agreed set of pieces. You interview them once a month and write from that. Two retainers in the niche are the stable shape. Sell a retainer after one paid project with that client. The AstroFinance package is ramp income, and it does not get a standing claim on the calendar.</w:t>
+        <w:t>The white paper is the offer you are known for. It is one document, then that project ends, which is why a paper-only practice stays lumpy: most companies want one or two a year. The retainer is how the same client gets the next paper without a new sale every time. Two paper retainers are the stable shape. Sell the retainer after the first paper with that client. The AstroFinance package is ramp income, and it does not get a standing claim on the calendar.</w:t>
       </w:r>
     </w:p>
     <w:p>
@@ -949,7 +949,7 @@
           <w:color w:val="1A1A1A"/>
           <w:sz w:val="20"/>
         </w:rPr>
-        <w:t>Propose three explainers for €2,100 total (€700 each), half up front, topics you choose: how the asset hub works, what an aerospace asset needs before it can be offered, and the security-token versus utility-token brief you have already had to write for a live prospect. Friendly, and still a real invoice. The public rate card keeps the same brief at €900–1,400, so the favor stays a favor.</w:t>
+        <w:t>Propose three short pieces for €2,100 total (€700 each), half up front, topics you choose: how the asset hub works, what an aerospace asset needs before it can be offered, and the security-token versus utility-token brief you have already had to write for a live prospect. That price is the floor of the public briefing rate, on purpose.</w:t>
       </w:r>
     </w:p>
     <w:p>
@@ -1252,7 +1252,7 @@
                 <w:color w:val="1A1A1A"/>
                 <w:sz w:val="16"/>
               </w:rPr>
-              <w:t>Three samples, live as links. (1) A 1,400-word essay drafted before you moderate: what AI can and cannot do inside carbon-accounting software, from the product side. (2) A public solution brief on where supplier-carbon or traceability rollouts break, using your method and public facts only. (3) A redacted AstroFinance product-and-strategy excerpt, after written permission. If permission lags, a clearly labeled sample blueprint stands in.</w:t>
+              <w:t>Three samples, live as links. (1) A 1,400-word essay drafted before you moderate: what AI can and cannot do inside carbon-accounting software, from the product side. (2) A short public white paper, about six pages, on where supplier-carbon programs break, using your method and public facts only. (3) A redacted AstroFinance product-and-strategy excerpt, after written permission. If permission lags, label a sample paper as a sample.</w:t>
             </w:r>
           </w:p>
         </w:tc>
@@ -1624,7 +1624,7 @@
                 <w:color w:val="1A1A1A"/>
                 <w:sz w:val="16"/>
               </w:rPr>
-              <w:t>Convert the first niche client into a three-month retainer. A second real-asset project waits if it would fill days you need for that pursuit. The paid piece, with permission, becomes sample four. Lift the brief floor to €1,100 once two paid clips exist. Decline work under €800.</w:t>
+              <w:t>Convert the first niche white paper into a paper retainer. A second real-asset project waits if it would fill days you need for that pursuit. The paid paper, with permission, becomes sample four. After two paid papers, the next one starts at €4,500. Decline briefings under €700 and papers under €3,500.</w:t>
             </w:r>
           </w:p>
         </w:tc>
@@ -1653,7 +1653,7 @@
                 <w:color w:val="1A1A1A"/>
                 <w:sz w:val="16"/>
               </w:rPr>
-              <w:t>One supply-chain climate retainer is signed.</w:t>
+              <w:t>One supply-chain climate client is on a paper retainer.</w:t>
             </w:r>
           </w:p>
         </w:tc>
@@ -2548,7 +2548,7 @@
           <w:color w:val="1A1A1A"/>
           <w:sz w:val="20"/>
         </w:rPr>
-        <w:t>If a fourth lane appears before month six, it waits. Open it only after the €5,200 month is real.</w:t>
+        <w:t>If another lane appears before a supply-chain climate retainer is signed, it waits.</w:t>
       </w:r>
     </w:p>
     <w:p>
@@ -2574,7 +2574,7 @@
           <w:color w:val="1A1A1A"/>
           <w:sz w:val="20"/>
         </w:rPr>
-        <w:t xml:space="preserve">Price floor €800, and €900 is the real brief. </w:t>
+        <w:t xml:space="preserve">Price floor. </w:t>
       </w:r>
       <w:r>
         <w:rPr>
@@ -2584,7 +2584,7 @@
           <w:color w:val="1A1A1A"/>
           <w:sz w:val="20"/>
         </w:rPr>
-        <w:t>Under that, the month becomes a volume job and the master’s year gets harder, not easier.</w:t>
+        <w:t>No briefing under €700, and no white paper under €3,500. Under that, the month becomes a volume job and the master’s year gets harder.</w:t>
       </w:r>
     </w:p>
     <w:p>

</xml_diff>

<commit_message>
Add case studies and regulatory briefings as parallel offers
Place both short formats beside the white paper, with fees, a French version of the case study, and a retainer that uses one of them each month.

Co-authored-by: nicolasmpicard-gif <nicolasmpicard-gif@users.noreply.github.com>
</commit_message>
<xml_diff>
--- a/Nicolas-Picard-Domain-Writing-Plan.docx
+++ b/Nicolas-Picard-Domain-Writing-Plan.docx
@@ -100,7 +100,7 @@
           <w:color w:val="1A1A1A"/>
           <w:sz w:val="20"/>
         </w:rPr>
-        <w:t>two paper retainers inside one niche. A white paper is a single sales asset, and that project ends. A paper retainer is the same client, the same monthly fee, funding one paper a quarter plus a short briefing each month. Ten to twelve writing days a month is the cap. AstroFinance and Dialectica can pay while the niche is forming. Judge the year on whether two supply-chain climate clients have hired you for a second paper. Pull the calendar forward if the master’s starts before October 2027.</w:t>
+        <w:t>two paper retainers inside one niche. A white paper is a single sales asset, and that project ends. A paper retainer is the same client, the same monthly fee, funding one paper a quarter plus one case study or regulatory briefing each month. Ten to twelve writing days a month is the cap. AstroFinance and Dialectica can pay while the niche is forming. Judge the year on whether two supply-chain climate clients have hired you for a second paper. Pull the calendar forward if the master’s starts before October 2027.</w:t>
       </w:r>
     </w:p>
     <w:p>
@@ -369,7 +369,7 @@
           <w:color w:val="1B3A2F"/>
           <w:sz w:val="24"/>
         </w:rPr>
-        <w:t>4.  Three formats, and what to charge in year one</w:t>
+        <w:t>4.  The white paper, and two parallel short pieces</w:t>
       </w:r>
     </w:p>
     <w:p>
@@ -681,7 +681,7 @@
                 <w:color w:val="1A1A1A"/>
                 <w:sz w:val="16"/>
               </w:rPr>
-              <w:t>Briefing</w:t>
+              <w:t>Case study</w:t>
             </w:r>
           </w:p>
         </w:tc>
@@ -710,7 +710,7 @@
                 <w:color w:val="1A1A1A"/>
                 <w:sz w:val="16"/>
               </w:rPr>
-              <w:t>800–1,200 words cut from the same research: one chapter, one regulatory point, or the public essay that points at the paper.</w:t>
+              <w:t>800–1,200 words from one customer interview. Sales uses it for a year. Same buyer as the paper. A French version is a second delivery, about 25% above the English fee.</w:t>
             </w:r>
           </w:p>
         </w:tc>
@@ -739,6 +739,127 @@
                 <w:color w:val="1A1A1A"/>
                 <w:sz w:val="16"/>
               </w:rPr>
+              <w:t>€1,000–1,800</w:t>
+            </w:r>
+          </w:p>
+        </w:tc>
+        <w:tc>
+          <w:tcPr>
+            <w:tcW w:type="dxa" w:w="1474"/>
+            <w:tcMar>
+              <w:top w:w="40" w:type="dxa"/>
+              <w:bottom w:w="40" w:type="dxa"/>
+              <w:left w:w="70" w:type="dxa"/>
+              <w:right w:w="70" w:type="dxa"/>
+            </w:tcMar>
+            <w:shd w:fill="FFFFFF" w:val="clear"/>
+            <w:vAlign w:val="center"/>
+          </w:tcPr>
+          <w:p>
+            <w:pPr>
+              <w:spacing w:before="0" w:after="0" w:line="240" w:lineRule="auto"/>
+            </w:pPr>
+            <w:r/>
+            <w:r>
+              <w:rPr>
+                <w:rFonts w:ascii="Calibri" w:hAnsi="Calibri" w:eastAsia="Calibri"/>
+                <w:b w:val="0"/>
+                <w:i w:val="0"/>
+                <w:color w:val="1A1A1A"/>
+                <w:sz w:val="16"/>
+              </w:rPr>
+              <w:t>1.5–2 days</w:t>
+            </w:r>
+          </w:p>
+        </w:tc>
+      </w:tr>
+      <w:tr>
+        <w:trPr>
+          <w:cantSplit/>
+        </w:trPr>
+        <w:tc>
+          <w:tcPr>
+            <w:tcW w:type="dxa" w:w="1474"/>
+            <w:tcMar>
+              <w:top w:w="40" w:type="dxa"/>
+              <w:bottom w:w="40" w:type="dxa"/>
+              <w:left w:w="70" w:type="dxa"/>
+              <w:right w:w="70" w:type="dxa"/>
+            </w:tcMar>
+            <w:shd w:fill="F3F6F4" w:val="clear"/>
+            <w:vAlign w:val="center"/>
+          </w:tcPr>
+          <w:p>
+            <w:pPr>
+              <w:spacing w:before="0" w:after="0" w:line="240" w:lineRule="auto"/>
+            </w:pPr>
+            <w:r/>
+            <w:r>
+              <w:rPr>
+                <w:rFonts w:ascii="Calibri" w:hAnsi="Calibri" w:eastAsia="Calibri"/>
+                <w:b w:val="0"/>
+                <w:i w:val="0"/>
+                <w:color w:val="1A1A1A"/>
+                <w:sz w:val="16"/>
+              </w:rPr>
+              <w:t>Regulatory briefing</w:t>
+            </w:r>
+          </w:p>
+        </w:tc>
+        <w:tc>
+          <w:tcPr>
+            <w:tcW w:type="dxa" w:w="4876"/>
+            <w:tcMar>
+              <w:top w:w="40" w:type="dxa"/>
+              <w:bottom w:w="40" w:type="dxa"/>
+              <w:left w:w="70" w:type="dxa"/>
+              <w:right w:w="70" w:type="dxa"/>
+            </w:tcMar>
+            <w:shd w:fill="F3F6F4" w:val="clear"/>
+            <w:vAlign w:val="center"/>
+          </w:tcPr>
+          <w:p>
+            <w:pPr>
+              <w:spacing w:before="0" w:after="0" w:line="240" w:lineRule="auto"/>
+            </w:pPr>
+            <w:r/>
+            <w:r>
+              <w:rPr>
+                <w:rFonts w:ascii="Calibri" w:hAnsi="Calibri" w:eastAsia="Calibri"/>
+                <w:b w:val="0"/>
+                <w:i w:val="0"/>
+                <w:color w:val="1A1A1A"/>
+                <w:sz w:val="16"/>
+              </w:rPr>
+              <w:t>One to two pages on what a CBAM, CSRD, or supplier-data change means for the product and the buyer. Written to be forwarded by sales. Their counsel owns the legal reading.</w:t>
+            </w:r>
+          </w:p>
+        </w:tc>
+        <w:tc>
+          <w:tcPr>
+            <w:tcW w:type="dxa" w:w="1984"/>
+            <w:tcMar>
+              <w:top w:w="40" w:type="dxa"/>
+              <w:bottom w:w="40" w:type="dxa"/>
+              <w:left w:w="70" w:type="dxa"/>
+              <w:right w:w="70" w:type="dxa"/>
+            </w:tcMar>
+            <w:shd w:fill="F3F6F4" w:val="clear"/>
+            <w:vAlign w:val="center"/>
+          </w:tcPr>
+          <w:p>
+            <w:pPr>
+              <w:spacing w:before="0" w:after="0" w:line="240" w:lineRule="auto"/>
+            </w:pPr>
+            <w:r/>
+            <w:r>
+              <w:rPr>
+                <w:rFonts w:ascii="Calibri" w:hAnsi="Calibri" w:eastAsia="Calibri"/>
+                <w:b w:val="0"/>
+                <w:i w:val="0"/>
+                <w:color w:val="1A1A1A"/>
+                <w:sz w:val="16"/>
+              </w:rPr>
               <w:t>€700–1,100</w:t>
             </w:r>
           </w:p>
@@ -752,7 +873,7 @@
               <w:left w:w="70" w:type="dxa"/>
               <w:right w:w="70" w:type="dxa"/>
             </w:tcMar>
-            <w:shd w:fill="FFFFFF" w:val="clear"/>
+            <w:shd w:fill="F3F6F4" w:val="clear"/>
             <w:vAlign w:val="center"/>
           </w:tcPr>
           <w:p>
@@ -786,7 +907,7 @@
               <w:left w:w="70" w:type="dxa"/>
               <w:right w:w="70" w:type="dxa"/>
             </w:tcMar>
-            <w:shd w:fill="F3F6F4" w:val="clear"/>
+            <w:shd w:fill="FFFFFF" w:val="clear"/>
             <w:vAlign w:val="center"/>
           </w:tcPr>
           <w:p>
@@ -815,7 +936,7 @@
               <w:left w:w="70" w:type="dxa"/>
               <w:right w:w="70" w:type="dxa"/>
             </w:tcMar>
-            <w:shd w:fill="F3F6F4" w:val="clear"/>
+            <w:shd w:fill="FFFFFF" w:val="clear"/>
             <w:vAlign w:val="center"/>
           </w:tcPr>
           <w:p>
@@ -831,7 +952,7 @@
                 <w:color w:val="1A1A1A"/>
                 <w:sz w:val="16"/>
               </w:rPr>
-              <w:t>Billed monthly. One white paper a quarter, plus one briefing a month from the same interviews. Six-month start is ideal; three months is the minimum.</w:t>
+              <w:t>Billed monthly. One white paper a quarter, plus one case study or one regulatory briefing a month. Six-month start is ideal; three months is the minimum.</w:t>
             </w:r>
           </w:p>
         </w:tc>
@@ -844,7 +965,7 @@
               <w:left w:w="70" w:type="dxa"/>
               <w:right w:w="70" w:type="dxa"/>
             </w:tcMar>
-            <w:shd w:fill="F3F6F4" w:val="clear"/>
+            <w:shd w:fill="FFFFFF" w:val="clear"/>
             <w:vAlign w:val="center"/>
           </w:tcPr>
           <w:p>
@@ -873,7 +994,7 @@
               <w:left w:w="70" w:type="dxa"/>
               <w:right w:w="70" w:type="dxa"/>
             </w:tcMar>
-            <w:shd w:fill="F3F6F4" w:val="clear"/>
+            <w:shd w:fill="FFFFFF" w:val="clear"/>
             <w:vAlign w:val="center"/>
           </w:tcPr>
           <w:p>
@@ -923,7 +1044,7 @@
           <w:color w:val="1A1A1A"/>
           <w:sz w:val="20"/>
         </w:rPr>
-        <w:t>The white paper is the offer you are known for. It is one document, then that project ends, which is why a paper-only practice stays lumpy: most companies want one or two a year. The retainer is how the same client gets the next paper without a new sale every time. Two paper retainers are the stable shape. Sell the retainer after the first paper with that client. The AstroFinance package is ramp income, and it does not get a standing claim on the calendar.</w:t>
+        <w:t>The white paper is the offer you are known for. The case study and the regulatory briefing are parallel offers for the same product-marketing buyer, in English or French, in Berlin or elsewhere. They are the work you sell in the months between papers. A paper-only practice stays lumpy, because most companies want one or two papers a year. The retainer bundles the next paper with one of those short pieces each month. Sell it after the first paid piece with that client. The AstroFinance package is ramp income, and it does not get a standing claim on the calendar.</w:t>
       </w:r>
     </w:p>
     <w:p>
@@ -965,7 +1086,7 @@
           <w:color w:val="1A1A1A"/>
           <w:sz w:val="20"/>
         </w:rPr>
-        <w:t>Leave on the shelf for this year: blog posts under €800, social-only ghostwriting under €1,500 a month, and full sustainability reports (a real market at €7,000 and up, and only sane once a client arrives with the data). Two trade-press bylines in the year, pitched from the roundtable essay, are marketing. They are part of the pipeline, and they are not the business.</w:t>
+        <w:t>Leave on the shelf for this year: SEO calendars, configuration and onboarding guides (customer success owns those), social-only ghostwriting under €1,500 a month, and full sustainability reports (a real market at €7,000 and up, and only sane once a client arrives with the data). Two trade-press bylines in the year, pitched from the roundtable essay, are marketing for the pipeline.</w:t>
       </w:r>
     </w:p>
     <w:p>
@@ -1252,7 +1373,7 @@
                 <w:color w:val="1A1A1A"/>
                 <w:sz w:val="16"/>
               </w:rPr>
-              <w:t>Three samples, live as links. (1) A 1,400-word essay drafted before you moderate: what AI can and cannot do inside carbon-accounting software, from the product side. (2) A short public white paper, about six pages, on where supplier-carbon programs break, using your method and public facts only. (3) A redacted AstroFinance product-and-strategy excerpt, after written permission. If permission lags, label a sample paper as a sample.</w:t>
+              <w:t>Three samples, live as links. (1) The regulatory-briefing sample: a 1,400-word essay, drafted before you moderate, on what AI can and cannot do inside carbon-accounting software. (2) A short public white paper, about six pages, on where supplier-carbon programs break, from public facts only. (3) A redacted AstroFinance excerpt, after written permission. The case-study sample is the first paid one, published only with the customer’s yes.</w:t>
             </w:r>
           </w:p>
         </w:tc>
@@ -1624,7 +1745,7 @@
                 <w:color w:val="1A1A1A"/>
                 <w:sz w:val="16"/>
               </w:rPr>
-              <w:t>Convert the first niche white paper into a paper retainer. A second real-asset project waits if it would fill days you need for that pursuit. The paid paper, with permission, becomes sample four. After two paid papers, the next one starts at €4,500. Decline briefings under €700 and papers under €3,500.</w:t>
+              <w:t>Convert the first niche piece, paper or case study, into a paper retainer. A second real-asset project waits if it would fill days you need for that pursuit. The paid paper, with permission, becomes a sample. After two paid papers, the next one starts at €4,500. Decline case studies under €1,000, briefings under €700, and papers under €3,500.</w:t>
             </w:r>
           </w:p>
         </w:tc>
@@ -1844,7 +1965,7 @@
           <w:color w:val="1A1A1A"/>
           <w:sz w:val="20"/>
         </w:rPr>
-        <w:t>The one sentence, the three writing products with the fees in section 4, and Schedule a chat. Proof you can link today: the AstroFinance Loom and the asset-hub page already on the site, plus the Nespresso supply-chain note you already cite. FIBE and the roundtable join as soon as you can name them in one line. The litepaper excerpt joins when AstroFinance agrees.</w:t>
+        <w:t>The one sentence, then the white paper, the case study, and the regulatory briefing, with the fees in section 4, and Schedule a chat. Proof you can link today: the AstroFinance Loom and the asset-hub page already on the site, plus the Nespresso supply-chain note you already cite. FIBE and the roundtable join as soon as you can name them in one line. The litepaper excerpt joins when AstroFinance agrees.</w:t>
       </w:r>
     </w:p>
     <w:p>
@@ -2007,7 +2128,7 @@
           <w:color w:val="1A1A1A"/>
           <w:sz w:val="20"/>
         </w:rPr>
-        <w:t>The roundtable essay, the public solution brief, and the permitted AstroFinance excerpt, each as a link on the page. The Loom and the asset-hub demo stay next to them, so a buyer sees that you have shipped the thing you are explaining.</w:t>
+        <w:t>The regulatory briefing, the short white paper, and the permitted AstroFinance excerpt, each as a link. The first paid case study joins when the customer agrees. The Loom and the asset-hub demo stay next to them.</w:t>
       </w:r>
     </w:p>
     <w:p>
@@ -2043,7 +2164,7 @@
           <w:color w:val="1A1A1A"/>
           <w:sz w:val="20"/>
         </w:rPr>
-        <w:t>Three products, the ranges above, two revisions, half to start, and a portfolio clause. A lawyer-drafted novel is unnecessary; a clear one-pager your Steuerberater has seen is enough.</w:t>
+        <w:t>The white paper, the case study, the regulatory briefing, and the retainer, with the ranges above. Two revisions, half to start, and a portfolio clause. A clear one-pager your Steuerberater has seen is enough.</w:t>
       </w:r>
     </w:p>
     <w:p>
@@ -2232,7 +2353,7 @@
           <w:color w:val="1A1A1A"/>
           <w:sz w:val="20"/>
         </w:rPr>
-        <w:t xml:space="preserve">2. Direct notes, then a coffee. </w:t>
+        <w:t xml:space="preserve">2. Direct notes, in English and French. </w:t>
       </w:r>
       <w:r>
         <w:rPr>
@@ -2242,7 +2363,7 @@
           <w:color w:val="1A1A1A"/>
           <w:sz w:val="20"/>
         </w:rPr>
-        <w:t>Heads of content, product marketing, and founders. Berlin’s climate and supply-chain scene is dense enough that a 30-minute coffee is a normal next step. Lead with a title you would write for their site.</w:t>
+        <w:t>Product-marketing leads and founders, in Berlin and beyond. A 30-minute call is the next step. Lead with a white-paper title or a case-study angle, and mention the French version when they sell in France.</w:t>
       </w:r>
     </w:p>
     <w:p>
@@ -2584,7 +2705,7 @@
           <w:color w:val="1A1A1A"/>
           <w:sz w:val="20"/>
         </w:rPr>
-        <w:t>No briefing under €700, and no white paper under €3,500. Under that, the month becomes a volume job and the master’s year gets harder.</w:t>
+        <w:t>No case study under €1,000, no regulatory briefing under €700, and no white paper under €3,500. Under that, the month becomes a volume job and the master’s year gets harder.</w:t>
       </w:r>
     </w:p>
     <w:p>

</xml_diff>

<commit_message>
Rewrite the writing plan in plainer language and name the target client.
Plain-language fixes replace the highlighted jargon, the public sentence now includes case studies, and the old rules section is folded into the timeline and the learning list.

Co-authored-by: nicolasmpicard-gif <nicolasmpicard-gif@users.noreply.github.com>
</commit_message>
<xml_diff>
--- a/Nicolas-Picard-Domain-Writing-Plan.docx
+++ b/Nicolas-Picard-Domain-Writing-Plan.docx
@@ -34,7 +34,7 @@
     </w:p>
     <w:p>
       <w:pPr>
-        <w:spacing w:before="160" w:after="40" w:line="245" w:lineRule="auto"/>
+        <w:spacing w:before="80" w:after="20" w:line="245" w:lineRule="auto"/>
         <w:keepNext/>
         <w:pBdr>
           <w:bottom w:val="single" w:sz="6" w:space="1" w:color="1B3A2F"/>
@@ -48,7 +48,7 @@
           <w:color w:val="1B3A2F"/>
           <w:sz w:val="24"/>
         </w:rPr>
-        <w:t>1.  The number you are actually chasing</w:t>
+        <w:t>1.  Target revenue</w:t>
       </w:r>
     </w:p>
     <w:p>
@@ -100,12 +100,12 @@
           <w:color w:val="1A1A1A"/>
           <w:sz w:val="20"/>
         </w:rPr>
-        <w:t>two paper retainers inside one niche. A white paper is a single sales asset, and that project ends. A paper retainer is the same client, the same monthly fee, funding one paper a quarter plus one case study or regulatory briefing each month. Ten to twelve writing days a month is the cap. AstroFinance and Dialectica can pay while the niche is forming. Judge the year on whether two supply-chain climate clients have hired you for a second paper. Pull the calendar forward if the master’s starts before October 2027.</w:t>
+        <w:t>two paper retainers inside one niche. A white paper is a single sales asset, and that project ends. A paper retainer is the same client, the same monthly fee, funding one paper a quarter plus one case study or regulatory briefing each month. Ten to twelve writing days a month is the cap. AstroFinance and Dialectica can pay while the niche is forming. Judge the year on whether two supply-chain climate clients have hired you for a second paper. If the master’s starts before October 2027, move to the lighter workload before classes begin. Do not wait until month 9.</w:t>
       </w:r>
     </w:p>
     <w:p>
       <w:pPr>
-        <w:spacing w:before="160" w:after="40" w:line="245" w:lineRule="auto"/>
+        <w:spacing w:before="80" w:after="20" w:line="245" w:lineRule="auto"/>
         <w:keepNext/>
         <w:pBdr>
           <w:bottom w:val="single" w:sz="6" w:space="1" w:color="1B3A2F"/>
@@ -119,7 +119,7 @@
           <w:color w:val="1B3A2F"/>
           <w:sz w:val="24"/>
         </w:rPr>
-        <w:t>2.  One offer, from seven CVs</w:t>
+        <w:t>2.  What I bring to the table</w:t>
       </w:r>
     </w:p>
     <w:p>
@@ -171,12 +171,12 @@
           <w:color w:val="1A1A1A"/>
           <w:sz w:val="20"/>
         </w:rPr>
-        <w:t>“I write practitioner white papers for supply-chain climate software teams.” The seven CV variants stay in the job-search folder. Clients hire the sentence, and they will check it on nicolaspicard.carrd.co.</w:t>
+        <w:t>“I write practitioner white papers and case studies for supply-chain climate software teams.” Use that sentence on LinkedIn and on the site. Decline other topics until a supply-chain climate client has signed a retainer. The seven CV variants stay in the job-search folder. Clients hire the sentence, and they will check it on nicolaspicard.carrd.co.</w:t>
       </w:r>
     </w:p>
     <w:p>
       <w:pPr>
-        <w:spacing w:before="160" w:after="40" w:line="245" w:lineRule="auto"/>
+        <w:spacing w:before="80" w:after="20" w:line="245" w:lineRule="auto"/>
         <w:keepNext/>
         <w:pBdr>
           <w:bottom w:val="single" w:sz="6" w:space="1" w:color="1B3A2F"/>
@@ -190,12 +190,12 @@
           <w:color w:val="1B3A2F"/>
           <w:sz w:val="24"/>
         </w:rPr>
-        <w:t>3.  One niche, and what sits beside it</w:t>
+        <w:t>3.  Domain concentration</w:t>
       </w:r>
     </w:p>
     <w:p>
       <w:pPr>
-        <w:spacing w:before="0" w:after="40" w:line="245" w:lineRule="auto"/>
+        <w:spacing w:before="0" w:after="20" w:line="245" w:lineRule="auto"/>
         <w:ind w:left="198" w:hanging="198"/>
       </w:pPr>
       <w:r>
@@ -231,7 +231,7 @@
     </w:p>
     <w:p>
       <w:pPr>
-        <w:spacing w:before="0" w:after="40" w:line="245" w:lineRule="auto"/>
+        <w:spacing w:before="0" w:after="20" w:line="245" w:lineRule="auto"/>
         <w:ind w:left="198" w:hanging="198"/>
       </w:pPr>
       <w:r>
@@ -252,7 +252,7 @@
           <w:color w:val="1A1A1A"/>
           <w:sz w:val="20"/>
         </w:rPr>
-        <w:t xml:space="preserve">Carbon accounting is the front door of that niche. </w:t>
+        <w:t xml:space="preserve">Carbon accounting goes in the title. </w:t>
       </w:r>
       <w:r>
         <w:rPr>
@@ -262,12 +262,12 @@
           <w:color w:val="1A1A1A"/>
           <w:sz w:val="20"/>
         </w:rPr>
-        <w:t>Lead with it in the title of the paper. The roundtable, the search demand, and the IntegrityNext feature make it the topic a marketing lead already understands. The paper itself is about the workflow: missing supplier data, CBAM upstream gaps, what the product has to show a buyer. A practice that explains GHG Protocol chapters for a living is a weaker fit, because those clients will ask you to be the accountant. Emissions factors, audits, and legal conclusions stay with their specialists.</w:t>
+        <w:t>The roundtable, the search demand, and the IntegrityNext feature make it the topic a marketing lead already understands. The paper explains missing supplier data, the upstream numbers CBAM asks for, and what the software has to show a buyer. Do not write chapters that teach the GHG Protocol. Clients who want that will ask you to be the accountant. Emission factors, audits, and legal conclusions stay with their specialists.</w:t>
       </w:r>
     </w:p>
     <w:p>
       <w:pPr>
-        <w:spacing w:before="0" w:after="40" w:line="245" w:lineRule="auto"/>
+        <w:spacing w:before="0" w:after="20" w:line="245" w:lineRule="auto"/>
         <w:ind w:left="198" w:hanging="198"/>
       </w:pPr>
       <w:r>
@@ -298,7 +298,7 @@
           <w:color w:val="1A1A1A"/>
           <w:sz w:val="20"/>
         </w:rPr>
-        <w:t>Take the AstroFinance package. It pays, and it becomes a sample. Have the one conversation with Tesseract Academy, since Stylianos and Linas Stankevicius already know the litepaper. Then stop hunting that market. A company buys a litepaper once, the buyer pool is small, and the work follows crypto sentiment. If a second real-asset project would crowd out a supply-chain climate retainer, decline it. Counsel reviews anything on token structure, and the footer says the piece is a product explanation.</w:t>
+        <w:t>Take the AstroFinance package. It pays, and a redacted excerpt can become a sample once they agree in writing. Skip Tesseract unless you specifically want that one conversation. Then stop hunting that market. A company buys a litepaper once, the buyer pool is small, and the work follows crypto sentiment. If a second real-asset project would crowd out a supply-chain climate retainer, decline it. Counsel reviews anything on token structure, and the footer says the piece is a product explanation.</w:t>
       </w:r>
     </w:p>
     <w:p>
@@ -355,7 +355,7 @@
     </w:p>
     <w:p>
       <w:pPr>
-        <w:spacing w:before="160" w:after="40" w:line="245" w:lineRule="auto"/>
+        <w:spacing w:before="80" w:after="20" w:line="245" w:lineRule="auto"/>
         <w:keepNext/>
         <w:pBdr>
           <w:bottom w:val="single" w:sz="6" w:space="1" w:color="1B3A2F"/>
@@ -369,7 +369,222 @@
           <w:color w:val="1B3A2F"/>
           <w:sz w:val="24"/>
         </w:rPr>
-        <w:t>4.  The white paper, and two parallel short pieces</w:t>
+        <w:t>Target client</w:t>
+      </w:r>
+    </w:p>
+    <w:p>
+      <w:pPr>
+        <w:spacing w:before="0" w:after="40" w:line="245" w:lineRule="auto"/>
+        <w:jc w:val="both"/>
+      </w:pPr>
+      <w:r>
+        <w:rPr>
+          <w:rFonts w:ascii="Calibri" w:hAnsi="Calibri" w:eastAsia="Calibri"/>
+          <w:b w:val="0"/>
+          <w:i w:val="0"/>
+          <w:color w:val="1A1A1A"/>
+          <w:sz w:val="20"/>
+        </w:rPr>
+        <w:t>Sell to the team that has to explain the product, and does not already employ someone whose full-time job is the paper, the case study, and the regulatory note.</w:t>
+      </w:r>
+    </w:p>
+    <w:p>
+      <w:pPr>
+        <w:spacing w:before="0" w:after="20" w:line="245" w:lineRule="auto"/>
+        <w:ind w:left="198" w:hanging="198"/>
+      </w:pPr>
+      <w:r>
+        <w:rPr>
+          <w:rFonts w:ascii="Calibri" w:hAnsi="Calibri" w:eastAsia="Calibri"/>
+          <w:b/>
+          <w:i w:val="0"/>
+          <w:color w:val="2D6A4F"/>
+          <w:sz w:val="20"/>
+        </w:rPr>
+        <w:t xml:space="preserve">•  </w:t>
+      </w:r>
+      <w:r>
+        <w:rPr>
+          <w:rFonts w:ascii="Calibri" w:hAnsi="Calibri" w:eastAsia="Calibri"/>
+          <w:b/>
+          <w:i w:val="0"/>
+          <w:color w:val="1A1A1A"/>
+          <w:sz w:val="20"/>
+        </w:rPr>
+        <w:t xml:space="preserve">What they sell. </w:t>
+      </w:r>
+      <w:r>
+        <w:rPr>
+          <w:rFonts w:ascii="Calibri" w:hAnsi="Calibri" w:eastAsia="Calibri"/>
+          <w:b w:val="0"/>
+          <w:i w:val="0"/>
+          <w:color w:val="1A1A1A"/>
+          <w:sz w:val="20"/>
+        </w:rPr>
+        <w:t>Supplier compliance, traceability, or carbon-data software. The person who reads the piece works in English or French.</w:t>
+      </w:r>
+    </w:p>
+    <w:p>
+      <w:pPr>
+        <w:spacing w:before="0" w:after="20" w:line="245" w:lineRule="auto"/>
+        <w:ind w:left="198" w:hanging="198"/>
+      </w:pPr>
+      <w:r>
+        <w:rPr>
+          <w:rFonts w:ascii="Calibri" w:hAnsi="Calibri" w:eastAsia="Calibri"/>
+          <w:b/>
+          <w:i w:val="0"/>
+          <w:color w:val="2D6A4F"/>
+          <w:sz w:val="20"/>
+        </w:rPr>
+        <w:t xml:space="preserve">•  </w:t>
+      </w:r>
+      <w:r>
+        <w:rPr>
+          <w:rFonts w:ascii="Calibri" w:hAnsi="Calibri" w:eastAsia="Calibri"/>
+          <w:b/>
+          <w:i w:val="0"/>
+          <w:color w:val="1A1A1A"/>
+          <w:sz w:val="20"/>
+        </w:rPr>
+        <w:t xml:space="preserve">Who is already on the marketing team. </w:t>
+      </w:r>
+      <w:r>
+        <w:rPr>
+          <w:rFonts w:ascii="Calibri" w:hAnsi="Calibri" w:eastAsia="Calibri"/>
+          <w:b w:val="0"/>
+          <w:i w:val="0"/>
+          <w:color w:val="1A1A1A"/>
+          <w:sz w:val="20"/>
+        </w:rPr>
+        <w:t>A founder, a head of marketing, or one to three generalists. The best note goes to a content lead who is the only person doing the job. Skip the company when a full-time content person already publishes white papers, case studies, and regulatory notes in your languages and is keeping up. IntegrityNext is that case, and you used to work there.</w:t>
+      </w:r>
+    </w:p>
+    <w:p>
+      <w:pPr>
+        <w:spacing w:before="0" w:after="20" w:line="245" w:lineRule="auto"/>
+        <w:ind w:left="198" w:hanging="198"/>
+      </w:pPr>
+      <w:r>
+        <w:rPr>
+          <w:rFonts w:ascii="Calibri" w:hAnsi="Calibri" w:eastAsia="Calibri"/>
+          <w:b/>
+          <w:i w:val="0"/>
+          <w:color w:val="2D6A4F"/>
+          <w:sz w:val="20"/>
+        </w:rPr>
+        <w:t xml:space="preserve">•  </w:t>
+      </w:r>
+      <w:r>
+        <w:rPr>
+          <w:rFonts w:ascii="Calibri" w:hAnsi="Calibri" w:eastAsia="Calibri"/>
+          <w:b/>
+          <w:i w:val="0"/>
+          <w:color w:val="1A1A1A"/>
+          <w:sz w:val="20"/>
+        </w:rPr>
+        <w:t xml:space="preserve">Headcount is a clue. </w:t>
+      </w:r>
+      <w:r>
+        <w:rPr>
+          <w:rFonts w:ascii="Calibri" w:hAnsi="Calibri" w:eastAsia="Calibri"/>
+          <w:b w:val="0"/>
+          <w:i w:val="0"/>
+          <w:color w:val="1A1A1A"/>
+          <w:sz w:val="20"/>
+        </w:rPr>
+        <w:t>Many of the better buyers have fewer than about 80 people. Fifty is a useful first sort, and it is wrong often enough to ignore as a rule: Climatiq is about 40–50 and already has a content manager. Plan A is larger, and its head of content left in 2025. Under about 30 people, and anywhere the team is shrinking, a €3,500 paper is a hard sale.</w:t>
+      </w:r>
+    </w:p>
+    <w:p>
+      <w:pPr>
+        <w:spacing w:before="0" w:after="20" w:line="245" w:lineRule="auto"/>
+        <w:ind w:left="198" w:hanging="198"/>
+      </w:pPr>
+      <w:r>
+        <w:rPr>
+          <w:rFonts w:ascii="Calibri" w:hAnsi="Calibri" w:eastAsia="Calibri"/>
+          <w:b/>
+          <w:i w:val="0"/>
+          <w:color w:val="2D6A4F"/>
+          <w:sz w:val="20"/>
+        </w:rPr>
+        <w:t xml:space="preserve">•  </w:t>
+      </w:r>
+      <w:r>
+        <w:rPr>
+          <w:rFonts w:ascii="Calibri" w:hAnsi="Calibri" w:eastAsia="Calibri"/>
+          <w:b/>
+          <w:i w:val="0"/>
+          <w:color w:val="1A1A1A"/>
+          <w:sz w:val="20"/>
+        </w:rPr>
+        <w:t xml:space="preserve">The public content is thin or old. </w:t>
+      </w:r>
+      <w:r>
+        <w:rPr>
+          <w:rFonts w:ascii="Calibri" w:hAnsi="Calibri" w:eastAsia="Calibri"/>
+          <w:b w:val="0"/>
+          <w:i w:val="0"/>
+          <w:color w:val="1A1A1A"/>
+          <w:sz w:val="20"/>
+        </w:rPr>
+        <w:t>No case studies, no paper a salesperson can send, a blog that has gone quiet, or an English-only library when they also sell in France. Name that gap in the email. Do not write “you need a writer.”</w:t>
+      </w:r>
+    </w:p>
+    <w:p>
+      <w:pPr>
+        <w:spacing w:before="0" w:after="40" w:line="245" w:lineRule="auto"/>
+        <w:ind w:left="198" w:hanging="198"/>
+      </w:pPr>
+      <w:r>
+        <w:rPr>
+          <w:rFonts w:ascii="Calibri" w:hAnsi="Calibri" w:eastAsia="Calibri"/>
+          <w:b/>
+          <w:i w:val="0"/>
+          <w:color w:val="2D6A4F"/>
+          <w:sz w:val="20"/>
+        </w:rPr>
+        <w:t xml:space="preserve">•  </w:t>
+      </w:r>
+      <w:r>
+        <w:rPr>
+          <w:rFonts w:ascii="Calibri" w:hAnsi="Calibri" w:eastAsia="Calibri"/>
+          <w:b/>
+          <w:i w:val="0"/>
+          <w:color w:val="1A1A1A"/>
+          <w:sz w:val="20"/>
+        </w:rPr>
+        <w:t xml:space="preserve">They still spend on marketing. </w:t>
+      </w:r>
+      <w:r>
+        <w:rPr>
+          <w:rFonts w:ascii="Calibri" w:hAnsi="Calibri" w:eastAsia="Calibri"/>
+          <w:b w:val="0"/>
+          <w:i w:val="0"/>
+          <w:color w:val="1A1A1A"/>
+          <w:sz w:val="20"/>
+        </w:rPr>
+        <w:t>A recent round, an open marketing role, or a marketing lead with no writer under them. After an acquisition, the budget may sit with the parent. Apave owns Aktio, and SGS owns Sami.</w:t>
+      </w:r>
+    </w:p>
+    <w:p>
+      <w:pPr>
+        <w:spacing w:before="80" w:after="20" w:line="245" w:lineRule="auto"/>
+        <w:keepNext/>
+        <w:pBdr>
+          <w:bottom w:val="single" w:sz="6" w:space="1" w:color="1B3A2F"/>
+        </w:pBdr>
+      </w:pPr>
+      <w:r>
+        <w:rPr>
+          <w:rFonts w:ascii="Calibri" w:hAnsi="Calibri" w:eastAsia="Calibri"/>
+          <w:b/>
+          <w:i w:val="0"/>
+          <w:color w:val="1B3A2F"/>
+          <w:sz w:val="24"/>
+        </w:rPr>
+        <w:t>4.  Product mix and potential rates</w:t>
       </w:r>
     </w:p>
     <w:p>
@@ -1091,7 +1306,7 @@
     </w:p>
     <w:p>
       <w:pPr>
-        <w:spacing w:before="160" w:after="40" w:line="245" w:lineRule="auto"/>
+        <w:spacing w:before="80" w:after="20" w:line="245" w:lineRule="auto"/>
         <w:keepNext/>
         <w:pBdr>
           <w:bottom w:val="single" w:sz="6" w:space="1" w:color="1B3A2F"/>
@@ -1105,7 +1320,7 @@
           <w:color w:val="1B3A2F"/>
           <w:sz w:val="24"/>
         </w:rPr>
-        <w:t>5.  The year, step by step</w:t>
+        <w:t>5.  Timeline</w:t>
       </w:r>
     </w:p>
     <w:tbl>
@@ -1281,7 +1496,7 @@
                 <w:color w:val="1A1A1A"/>
                 <w:sz w:val="16"/>
               </w:rPr>
-              <w:t>Steuerberater: Freiberufler, KSK application, Kleinunternehmer, invoice line. Rewrite LinkedIn and the Carrd to the same sentence (section 6). One-page offer. One-page contract: scope, two revisions, 50% to start, kill fee, confidentiality, right to show a redacted sample.</w:t>
+              <w:t>Steuerberater: Freiberufler, KSK application, Kleinunternehmer, and what the invoice must say. Rewrite LinkedIn and the Carrd to the same sentence (section 6). A one-page price sheet. A one-page contract: what you will deliver, two rounds of edits, half the fee before you start, a fee if they cancel, confidentiality, and permission to show a version with private details removed.</w:t>
             </w:r>
           </w:p>
         </w:tc>
@@ -1465,7 +1680,7 @@
                 <w:color w:val="1A1A1A"/>
                 <w:sz w:val="16"/>
               </w:rPr>
-              <w:t>Moderate. Within 72 hours publish a short point-of-view recap, with quotes from others only where you have a yes. Send it to each speaker and to 15 climate founders, with one line on what you write and the fee range.</w:t>
+              <w:t>Moderate. Within 72 hours, publish a short article that states your own conclusion. Do not quote anyone without their consent. Email it to the speakers and to 15 founders, with one line on what you write and what you charge.</w:t>
             </w:r>
           </w:p>
         </w:tc>
@@ -1557,7 +1772,7 @@
                 <w:color w:val="1A1A1A"/>
                 <w:sz w:val="16"/>
               </w:rPr>
-              <w:t>Two warm asks, then the niche list. AstroFinance: the €2,100 package, topics and price in the same note. Tesseract: one note about subcontracted litepaper sections, then stop. The list of 40 is supply-chain climate and compliance firms only: content leads and founders. Eight personal notes a week. Each note names a page on their site and proposes one title.</w:t>
+              <w:t>Email AstroFinance the €2,100 package, with the topics and the price in the same note. Skip Tesseract unless you specifically want that one conversation. Then work the company list: supply-chain climate and compliance firms only. Eight personal emails a week. Each email names one page on their site and proposes one title.</w:t>
             </w:r>
           </w:p>
         </w:tc>
@@ -1874,7 +2089,7 @@
     </w:tbl>
     <w:p>
       <w:pPr>
-        <w:spacing w:before="160" w:after="40" w:line="245" w:lineRule="auto"/>
+        <w:spacing w:before="80" w:after="20" w:line="245" w:lineRule="auto"/>
         <w:keepNext/>
         <w:pBdr>
           <w:bottom w:val="single" w:sz="6" w:space="1" w:color="1B3A2F"/>
@@ -1888,7 +2103,7 @@
           <w:color w:val="1B3A2F"/>
           <w:sz w:val="24"/>
         </w:rPr>
-        <w:t>6.  The Carrd, before the first email</w:t>
+        <w:t>6.  Professional Website Update</w:t>
       </w:r>
     </w:p>
     <w:p>
@@ -1929,12 +2144,12 @@
           <w:color w:val="1A1A1A"/>
           <w:sz w:val="20"/>
         </w:rPr>
-        <w:t>Rewrite that same URL in week 1. A new site can wait.</w:t>
+        <w:t>Edit the words on this same URL in week 1. You do not need a new website.</w:t>
       </w:r>
     </w:p>
     <w:p>
       <w:pPr>
-        <w:spacing w:before="0" w:after="40" w:line="245" w:lineRule="auto"/>
+        <w:spacing w:before="0" w:after="20" w:line="245" w:lineRule="auto"/>
         <w:ind w:left="198" w:hanging="198"/>
       </w:pPr>
       <w:r>
@@ -1970,7 +2185,7 @@
     </w:p>
     <w:p>
       <w:pPr>
-        <w:spacing w:before="0" w:after="40" w:line="245" w:lineRule="auto"/>
+        <w:spacing w:before="0" w:after="20" w:line="245" w:lineRule="auto"/>
         <w:ind w:left="198" w:hanging="198"/>
       </w:pPr>
       <w:r>
@@ -2006,7 +2221,7 @@
     </w:p>
     <w:p>
       <w:pPr>
-        <w:spacing w:before="0" w:after="40" w:line="245" w:lineRule="auto"/>
+        <w:spacing w:before="0" w:after="20" w:line="245" w:lineRule="auto"/>
         <w:ind w:left="198" w:hanging="198"/>
       </w:pPr>
       <w:r>
@@ -2078,7 +2293,7 @@
     </w:p>
     <w:p>
       <w:pPr>
-        <w:spacing w:before="160" w:after="40" w:line="245" w:lineRule="auto"/>
+        <w:spacing w:before="80" w:after="20" w:line="245" w:lineRule="auto"/>
         <w:keepNext/>
         <w:pBdr>
           <w:bottom w:val="single" w:sz="6" w:space="1" w:color="1B3A2F"/>
@@ -2097,7 +2312,7 @@
     </w:p>
     <w:p>
       <w:pPr>
-        <w:spacing w:before="0" w:after="40" w:line="245" w:lineRule="auto"/>
+        <w:spacing w:before="0" w:after="20" w:line="245" w:lineRule="auto"/>
         <w:ind w:left="198" w:hanging="198"/>
       </w:pPr>
       <w:r>
@@ -2133,7 +2348,7 @@
     </w:p>
     <w:p>
       <w:pPr>
-        <w:spacing w:before="0" w:after="40" w:line="245" w:lineRule="auto"/>
+        <w:spacing w:before="0" w:after="20" w:line="245" w:lineRule="auto"/>
         <w:ind w:left="198" w:hanging="198"/>
       </w:pPr>
       <w:r>
@@ -2169,7 +2384,7 @@
     </w:p>
     <w:p>
       <w:pPr>
-        <w:spacing w:before="0" w:after="40" w:line="245" w:lineRule="auto"/>
+        <w:spacing w:before="0" w:after="20" w:line="245" w:lineRule="auto"/>
         <w:ind w:left="198" w:hanging="198"/>
       </w:pPr>
       <w:r>
@@ -2200,12 +2415,12 @@
           <w:color w:val="1A1A1A"/>
           <w:sz w:val="20"/>
         </w:rPr>
-        <w:t>Every number comes from a public source or the client’s file. The footer on technical pieces: practitioner explanation; carbon-accounting, legal, and investment advice remain with the client’s specialists.</w:t>
+        <w:t>Do not invent statistics. Every number comes from a public source or from the client’s own file. On any technical piece, add one line: this is an explanation of the product, not emissions advice, legal advice, or investment advice.</w:t>
       </w:r>
     </w:p>
     <w:p>
       <w:pPr>
-        <w:spacing w:before="0" w:after="40" w:line="245" w:lineRule="auto"/>
+        <w:spacing w:before="0" w:after="20" w:line="245" w:lineRule="auto"/>
         <w:ind w:left="198" w:hanging="198"/>
       </w:pPr>
       <w:r>
@@ -2236,7 +2451,7 @@
           <w:color w:val="1A1A1A"/>
           <w:sz w:val="20"/>
         </w:rPr>
-        <w:t>Nespresso, the coffee trader, IntegrityNext, Walmart, J&amp;J, and AstroFinance details appear only when already public or cleared in writing. Role, method, and results you already state on LinkedIn are the safe set.</w:t>
+        <w:t>Do not publish a client’s private figures without written consent. Nespresso, the coffee trader, IntegrityNext, Walmart, J&amp;J, and AstroFinance details appear only when already public or cleared in writing. Role, method, and results you already state on LinkedIn are the safe set.</w:t>
       </w:r>
     </w:p>
     <w:p>
@@ -2262,7 +2477,7 @@
           <w:color w:val="1A1A1A"/>
           <w:sz w:val="20"/>
         </w:rPr>
-        <w:t xml:space="preserve">A swipe file. </w:t>
+        <w:t xml:space="preserve">A folder of models. </w:t>
       </w:r>
       <w:r>
         <w:rPr>
@@ -2272,12 +2487,12 @@
           <w:color w:val="1A1A1A"/>
           <w:sz w:val="20"/>
         </w:rPr>
-        <w:t>Five pieces you wish you had written, one folder per lane. Match their structure. The sentences stay yours.</w:t>
+        <w:t>Keep five pieces you admire in one folder. Copy how they are built. Do not copy their sentences.</w:t>
       </w:r>
     </w:p>
     <w:p>
       <w:pPr>
-        <w:spacing w:before="160" w:after="40" w:line="245" w:lineRule="auto"/>
+        <w:spacing w:before="80" w:after="20" w:line="245" w:lineRule="auto"/>
         <w:keepNext/>
         <w:pBdr>
           <w:bottom w:val="single" w:sz="6" w:space="1" w:color="1B3A2F"/>
@@ -2291,12 +2506,12 @@
           <w:color w:val="1B3A2F"/>
           <w:sz w:val="24"/>
         </w:rPr>
-        <w:t>8.  Where the commissions come from</w:t>
+        <w:t>8.  Business development</w:t>
       </w:r>
     </w:p>
     <w:p>
       <w:pPr>
-        <w:spacing w:before="0" w:after="40" w:line="245" w:lineRule="auto"/>
+        <w:spacing w:before="0" w:after="20" w:line="245" w:lineRule="auto"/>
         <w:ind w:left="198" w:hanging="198"/>
       </w:pPr>
       <w:r>
@@ -2327,12 +2542,12 @@
           <w:color w:val="1A1A1A"/>
           <w:sz w:val="20"/>
         </w:rPr>
-        <w:t>AstroFinance, Tesseract, the roundtable speakers, FIBE contacts, Dialectica’s team, and former colleagues now at climate startups. This is the whole first quarter.</w:t>
+        <w:t>AstroFinance, the roundtable speakers, FIBE contacts, Dialectica’s team, and former colleagues now at climate startups. This is the whole first quarter. Skip Tesseract unless you specifically want that one conversation.</w:t>
       </w:r>
     </w:p>
     <w:p>
       <w:pPr>
-        <w:spacing w:before="0" w:after="40" w:line="245" w:lineRule="auto"/>
+        <w:spacing w:before="0" w:after="20" w:line="245" w:lineRule="auto"/>
         <w:ind w:left="198" w:hanging="198"/>
       </w:pPr>
       <w:r>
@@ -2363,12 +2578,12 @@
           <w:color w:val="1A1A1A"/>
           <w:sz w:val="20"/>
         </w:rPr>
-        <w:t>Product-marketing leads and founders, in Berlin and beyond. A 30-minute call is the next step. Lead with a white-paper title or a case-study angle, and mention the French version when they sell in France.</w:t>
+        <w:t>Start with the high-probability companies on the list: a thin marketing team, or no content person, and a page you can name. Then write the content lead at a staffed firm only when you can name one gap, such as a French version or a missing case study. A 30-minute call is the next step.</w:t>
       </w:r>
     </w:p>
     <w:p>
       <w:pPr>
-        <w:spacing w:before="0" w:after="40" w:line="245" w:lineRule="auto"/>
+        <w:spacing w:before="0" w:after="20" w:line="245" w:lineRule="auto"/>
         <w:ind w:left="198" w:hanging="198"/>
       </w:pPr>
       <w:r>
@@ -2404,7 +2619,7 @@
     </w:p>
     <w:p>
       <w:pPr>
-        <w:spacing w:before="0" w:after="40" w:line="245" w:lineRule="auto"/>
+        <w:spacing w:before="0" w:after="20" w:line="245" w:lineRule="auto"/>
         <w:ind w:left="198" w:hanging="198"/>
       </w:pPr>
       <w:r>
@@ -2425,7 +2640,7 @@
           <w:color w:val="1A1A1A"/>
           <w:sz w:val="20"/>
         </w:rPr>
-        <w:t xml:space="preserve">4. Studios that already sell the format. </w:t>
+        <w:t xml:space="preserve">4. Consultancies and the new owners. </w:t>
       </w:r>
       <w:r>
         <w:rPr>
@@ -2435,7 +2650,7 @@
           <w:color w:val="1A1A1A"/>
           <w:sz w:val="20"/>
         </w:rPr>
-        <w:t>Tesseract is the model: they win the client, you write the specialist sections, you know your minimum before you accept their rate. Ask them who else they respect.</w:t>
+        <w:t>EcoAct, South Pole, and the groups that acquired these tools already pay outside writers for supplier-carbon and CBAM work. Skip crypto agencies.</w:t>
       </w:r>
     </w:p>
     <w:p>
@@ -2461,7 +2676,7 @@
           <w:color w:val="1A1A1A"/>
           <w:sz w:val="20"/>
         </w:rPr>
-        <w:t xml:space="preserve">5. Talent lists, only after two public clips. </w:t>
+        <w:t xml:space="preserve">5. Talent lists, only after two public pieces. </w:t>
       </w:r>
       <w:r>
         <w:rPr>
@@ -2471,12 +2686,12 @@
           <w:color w:val="1A1A1A"/>
           <w:sz w:val="20"/>
         </w:rPr>
-        <w:t>A niche roster, Contently if the door opens, and one Upwork profile that lists only the three products and a high minimum. General freelance boards pull the rate card down. Use them late, or leave them.</w:t>
+        <w:t>Open Malt, Contently, or one Upwork profile only after the roundtable essay and the short public paper exist. List only the three services, and list the minimum prices.</w:t>
       </w:r>
     </w:p>
     <w:p>
       <w:pPr>
-        <w:spacing w:before="160" w:after="40" w:line="245" w:lineRule="auto"/>
+        <w:spacing w:before="80" w:after="20" w:line="245" w:lineRule="auto"/>
         <w:keepNext/>
         <w:pBdr>
           <w:bottom w:val="single" w:sz="6" w:space="1" w:color="1B3A2F"/>
@@ -2490,12 +2705,12 @@
           <w:color w:val="1B3A2F"/>
           <w:sz w:val="24"/>
         </w:rPr>
-        <w:t>9.  What is worth learning</w:t>
+        <w:t>9.  Learning Plan</w:t>
       </w:r>
     </w:p>
     <w:p>
       <w:pPr>
-        <w:spacing w:before="0" w:after="40" w:line="245" w:lineRule="auto"/>
+        <w:spacing w:before="0" w:after="20" w:line="245" w:lineRule="auto"/>
         <w:ind w:left="198" w:hanging="198"/>
       </w:pPr>
       <w:r>
@@ -2526,12 +2741,12 @@
           <w:color w:val="1A1A1A"/>
           <w:sz w:val="20"/>
         </w:rPr>
-        <w:t>GHG Protocol scopes, spend-based versus activity-based factors, and what CBAM and CSRD actually ask of supplier data. You have specified this product. The goal is a draft a sustainability lead can trust.</w:t>
+        <w:t>GHG Protocol scopes, spend-based versus activity-based factors, and what CBAM and CSRD actually ask of supplier data. You have specified this product. The goal is a draft a sustainability lead can trust. The pages are under What to read.</w:t>
       </w:r>
     </w:p>
     <w:p>
       <w:pPr>
-        <w:spacing w:before="0" w:after="40" w:line="245" w:lineRule="auto"/>
+        <w:spacing w:before="0" w:after="20" w:line="245" w:lineRule="auto"/>
         <w:ind w:left="198" w:hanging="198"/>
       </w:pPr>
       <w:r>
@@ -2562,7 +2777,7 @@
           <w:color w:val="1A1A1A"/>
           <w:sz w:val="20"/>
         </w:rPr>
-        <w:t>How a content manager writes a brief, what a single keyword is for, how internal links work. Enough to deliver the AstroFinance pieces and to talk fees with a head of content.</w:t>
+        <w:t>How a content manager writes a brief. A keyword is the phrase someone types into Google. An internal link is a link from one page on their site to another page on the same site. Enough to deliver the AstroFinance pieces and to talk fees with a head of content.</w:t>
       </w:r>
     </w:p>
     <w:p>
@@ -2598,7 +2813,7 @@
           <w:color w:val="1A1A1A"/>
           <w:sz w:val="20"/>
         </w:rPr>
-        <w:t>KSK application, what you can deduct, invoice wording, and the difference between Freiberufler and a trade. That afternoon with a Steuerberater returns more than another certificate.</w:t>
+        <w:t>The KSK application, what you can deduct, invoice wording, and the difference between a Freiberufler and a trade. That afternoon with a Steuerberater returns more than another certificate.</w:t>
       </w:r>
     </w:p>
     <w:p>
@@ -2619,7 +2834,7 @@
     </w:p>
     <w:p>
       <w:pPr>
-        <w:spacing w:before="160" w:after="40" w:line="245" w:lineRule="auto"/>
+        <w:spacing w:before="80" w:after="20" w:line="245" w:lineRule="auto"/>
         <w:keepNext/>
         <w:pBdr>
           <w:bottom w:val="single" w:sz="6" w:space="1" w:color="1B3A2F"/>
@@ -2633,12 +2848,12 @@
           <w:color w:val="1B3A2F"/>
           <w:sz w:val="24"/>
         </w:rPr>
-        <w:t>10.  Rules that keep the year intact</w:t>
+        <w:t>What to read</w:t>
       </w:r>
     </w:p>
     <w:p>
       <w:pPr>
-        <w:spacing w:before="0" w:after="40" w:line="245" w:lineRule="auto"/>
+        <w:spacing w:before="0" w:after="20" w:line="245" w:lineRule="auto"/>
         <w:ind w:left="198" w:hanging="198"/>
       </w:pPr>
       <w:r>
@@ -2659,8 +2874,19 @@
           <w:color w:val="1A1A1A"/>
           <w:sz w:val="20"/>
         </w:rPr>
-        <w:t xml:space="preserve">One sentence in public. </w:t>
+        <w:t xml:space="preserve">Carbon and supplier data. </w:t>
       </w:r>
+      <w:hyperlink r:id="rId9">
+        <w:r>
+          <w:rPr>
+            <w:rFonts w:ascii="Calibri" w:hAnsi="Calibri"/>
+            <w:sz w:val="20"/>
+            <w:color w:val="2D6A4F"/>
+            <w:u w:val="single"/>
+          </w:rPr>
+          <w:t xml:space="preserve">GHG Protocol Corporate Standard</w:t>
+        </w:r>
+      </w:hyperlink>
       <w:r>
         <w:rPr>
           <w:rFonts w:ascii="Calibri" w:hAnsi="Calibri" w:eastAsia="Calibri"/>
@@ -2669,12 +2895,96 @@
           <w:color w:val="1A1A1A"/>
           <w:sz w:val="20"/>
         </w:rPr>
-        <w:t>If another lane appears before a supply-chain climate retainer is signed, it waits.</w:t>
+        <w:t xml:space="preserve">, </w:t>
+      </w:r>
+      <w:hyperlink r:id="rId10">
+        <w:r>
+          <w:rPr>
+            <w:rFonts w:ascii="Calibri" w:hAnsi="Calibri"/>
+            <w:sz w:val="20"/>
+            <w:color w:val="2D6A4F"/>
+            <w:u w:val="single"/>
+          </w:rPr>
+          <w:t xml:space="preserve">Scope 2 Guidance</w:t>
+        </w:r>
+      </w:hyperlink>
+      <w:r>
+        <w:rPr>
+          <w:rFonts w:ascii="Calibri" w:hAnsi="Calibri" w:eastAsia="Calibri"/>
+          <w:b w:val="0"/>
+          <w:i w:val="0"/>
+          <w:color w:val="1A1A1A"/>
+          <w:sz w:val="20"/>
+        </w:rPr>
+        <w:t xml:space="preserve">, </w:t>
+      </w:r>
+      <w:hyperlink r:id="rId11">
+        <w:r>
+          <w:rPr>
+            <w:rFonts w:ascii="Calibri" w:hAnsi="Calibri"/>
+            <w:sz w:val="20"/>
+            <w:color w:val="2D6A4F"/>
+            <w:u w:val="single"/>
+          </w:rPr>
+          <w:t xml:space="preserve">Scope 3 Standard</w:t>
+        </w:r>
+      </w:hyperlink>
+      <w:r>
+        <w:rPr>
+          <w:rFonts w:ascii="Calibri" w:hAnsi="Calibri" w:eastAsia="Calibri"/>
+          <w:b w:val="0"/>
+          <w:i w:val="0"/>
+          <w:color w:val="1A1A1A"/>
+          <w:sz w:val="20"/>
+        </w:rPr>
+        <w:t xml:space="preserve">, </w:t>
+      </w:r>
+      <w:hyperlink r:id="rId12">
+        <w:r>
+          <w:rPr>
+            <w:rFonts w:ascii="Calibri" w:hAnsi="Calibri"/>
+            <w:sz w:val="20"/>
+            <w:color w:val="2D6A4F"/>
+            <w:u w:val="single"/>
+          </w:rPr>
+          <w:t xml:space="preserve">Scope 3 Calculation Guidance</w:t>
+        </w:r>
+      </w:hyperlink>
+      <w:r>
+        <w:rPr>
+          <w:rFonts w:ascii="Calibri" w:hAnsi="Calibri" w:eastAsia="Calibri"/>
+          <w:b w:val="0"/>
+          <w:i w:val="0"/>
+          <w:color w:val="1A1A1A"/>
+          <w:sz w:val="20"/>
+        </w:rPr>
+        <w:t xml:space="preserve">, and the French emission-factor library </w:t>
+      </w:r>
+      <w:hyperlink r:id="rId13">
+        <w:r>
+          <w:rPr>
+            <w:rFonts w:ascii="Calibri" w:hAnsi="Calibri"/>
+            <w:sz w:val="20"/>
+            <w:color w:val="2D6A4F"/>
+            <w:u w:val="single"/>
+          </w:rPr>
+          <w:t xml:space="preserve">ADEME Base Empreinte</w:t>
+        </w:r>
+      </w:hyperlink>
+      <w:r>
+        <w:rPr>
+          <w:rFonts w:ascii="Calibri" w:hAnsi="Calibri" w:eastAsia="Calibri"/>
+          <w:b w:val="0"/>
+          <w:i w:val="0"/>
+          <w:color w:val="1A1A1A"/>
+          <w:sz w:val="20"/>
+        </w:rPr>
+        <w:t>.</w:t>
       </w:r>
     </w:p>
     <w:p>
       <w:pPr>
-        <w:spacing w:before="0" w:after="40" w:line="245" w:lineRule="auto"/>
+        <w:spacing w:before="0" w:after="20" w:line="245" w:lineRule="auto"/>
         <w:ind w:left="198" w:hanging="198"/>
       </w:pPr>
       <w:r>
@@ -2695,8 +3005,19 @@
           <w:color w:val="1A1A1A"/>
           <w:sz w:val="20"/>
         </w:rPr>
-        <w:t xml:space="preserve">Price floor. </w:t>
+        <w:t xml:space="preserve">The rules buyers ask about. </w:t>
       </w:r>
+      <w:hyperlink r:id="rId14">
+        <w:r>
+          <w:rPr>
+            <w:rFonts w:ascii="Calibri" w:hAnsi="Calibri"/>
+            <w:sz w:val="20"/>
+            <w:color w:val="2D6A4F"/>
+            <w:u w:val="single"/>
+          </w:rPr>
+          <w:t xml:space="preserve">CBAM, English</w:t>
+        </w:r>
+      </w:hyperlink>
       <w:r>
         <w:rPr>
           <w:rFonts w:ascii="Calibri" w:hAnsi="Calibri" w:eastAsia="Calibri"/>
@@ -2705,12 +3026,75 @@
           <w:color w:val="1A1A1A"/>
           <w:sz w:val="20"/>
         </w:rPr>
-        <w:t>No case study under €1,000, no regulatory briefing under €700, and no white paper under €3,500. Under that, the month becomes a volume job and the master’s year gets harder.</w:t>
+        <w:t xml:space="preserve"> and </w:t>
+      </w:r>
+      <w:hyperlink r:id="rId15">
+        <w:r>
+          <w:rPr>
+            <w:rFonts w:ascii="Calibri" w:hAnsi="Calibri"/>
+            <w:sz w:val="20"/>
+            <w:color w:val="2D6A4F"/>
+            <w:u w:val="single"/>
+          </w:rPr>
+          <w:t xml:space="preserve">French</w:t>
+        </w:r>
+      </w:hyperlink>
+      <w:r>
+        <w:rPr>
+          <w:rFonts w:ascii="Calibri" w:hAnsi="Calibri" w:eastAsia="Calibri"/>
+          <w:b w:val="0"/>
+          <w:i w:val="0"/>
+          <w:color w:val="1A1A1A"/>
+          <w:sz w:val="20"/>
+        </w:rPr>
+        <w:t xml:space="preserve">, the </w:t>
+      </w:r>
+      <w:hyperlink r:id="rId16">
+        <w:r>
+          <w:rPr>
+            <w:rFonts w:ascii="Calibri" w:hAnsi="Calibri"/>
+            <w:sz w:val="20"/>
+            <w:color w:val="2D6A4F"/>
+            <w:u w:val="single"/>
+          </w:rPr>
+          <w:t xml:space="preserve">CSRD page</w:t>
+        </w:r>
+      </w:hyperlink>
+      <w:r>
+        <w:rPr>
+          <w:rFonts w:ascii="Calibri" w:hAnsi="Calibri" w:eastAsia="Calibri"/>
+          <w:b w:val="0"/>
+          <w:i w:val="0"/>
+          <w:color w:val="1A1A1A"/>
+          <w:sz w:val="20"/>
+        </w:rPr>
+        <w:t xml:space="preserve">, and the </w:t>
+      </w:r>
+      <w:hyperlink r:id="rId17">
+        <w:r>
+          <w:rPr>
+            <w:rFonts w:ascii="Calibri" w:hAnsi="Calibri"/>
+            <w:sz w:val="20"/>
+            <w:color w:val="2D6A4F"/>
+            <w:u w:val="single"/>
+          </w:rPr>
+          <w:t xml:space="preserve">ESRS standards</w:t>
+        </w:r>
+      </w:hyperlink>
+      <w:r>
+        <w:rPr>
+          <w:rFonts w:ascii="Calibri" w:hAnsi="Calibri" w:eastAsia="Calibri"/>
+          <w:b w:val="0"/>
+          <w:i w:val="0"/>
+          <w:color w:val="1A1A1A"/>
+          <w:sz w:val="20"/>
+        </w:rPr>
+        <w:t>.</w:t>
       </w:r>
     </w:p>
     <w:p>
       <w:pPr>
-        <w:spacing w:before="0" w:after="40" w:line="245" w:lineRule="auto"/>
+        <w:spacing w:before="0" w:after="20" w:line="245" w:lineRule="auto"/>
         <w:ind w:left="198" w:hanging="198"/>
       </w:pPr>
       <w:r>
@@ -2731,8 +3115,19 @@
           <w:color w:val="1A1A1A"/>
           <w:sz w:val="20"/>
         </w:rPr>
-        <w:t xml:space="preserve">Your name stays clean. </w:t>
+        <w:t xml:space="preserve">Search, one week. </w:t>
       </w:r>
+      <w:hyperlink r:id="rId18">
+        <w:r>
+          <w:rPr>
+            <w:rFonts w:ascii="Calibri" w:hAnsi="Calibri"/>
+            <w:sz w:val="20"/>
+            <w:color w:val="2D6A4F"/>
+            <w:u w:val="single"/>
+          </w:rPr>
+          <w:t xml:space="preserve">Google’s SEO Starter Guide</w:t>
+        </w:r>
+      </w:hyperlink>
       <w:r>
         <w:rPr>
           <w:rFonts w:ascii="Calibri" w:hAnsi="Calibri" w:eastAsia="Calibri"/>
@@ -2741,7 +3136,49 @@
           <w:color w:val="1A1A1A"/>
           <w:sz w:val="20"/>
         </w:rPr>
-        <w:t>No client numbers without permission. No technical piece without the footer. No litepaper that reads like an offer of securities.</w:t>
+        <w:t xml:space="preserve">, </w:t>
+      </w:r>
+      <w:hyperlink r:id="rId19">
+        <w:r>
+          <w:rPr>
+            <w:rFonts w:ascii="Calibri" w:hAnsi="Calibri"/>
+            <w:sz w:val="20"/>
+            <w:color w:val="2D6A4F"/>
+            <w:u w:val="single"/>
+          </w:rPr>
+          <w:t xml:space="preserve">how links work</w:t>
+        </w:r>
+      </w:hyperlink>
+      <w:r>
+        <w:rPr>
+          <w:rFonts w:ascii="Calibri" w:hAnsi="Calibri" w:eastAsia="Calibri"/>
+          <w:b w:val="0"/>
+          <w:i w:val="0"/>
+          <w:color w:val="1A1A1A"/>
+          <w:sz w:val="20"/>
+        </w:rPr>
+        <w:t xml:space="preserve">, and </w:t>
+      </w:r>
+      <w:hyperlink r:id="rId20">
+        <w:r>
+          <w:rPr>
+            <w:rFonts w:ascii="Calibri" w:hAnsi="Calibri"/>
+            <w:sz w:val="20"/>
+            <w:color w:val="2D6A4F"/>
+            <w:u w:val="single"/>
+          </w:rPr>
+          <w:t xml:space="preserve">Ahrefs on keyword research</w:t>
+        </w:r>
+      </w:hyperlink>
+      <w:r>
+        <w:rPr>
+          <w:rFonts w:ascii="Calibri" w:hAnsi="Calibri" w:eastAsia="Calibri"/>
+          <w:b w:val="0"/>
+          <w:i w:val="0"/>
+          <w:color w:val="1A1A1A"/>
+          <w:sz w:val="20"/>
+        </w:rPr>
+        <w:t>.</w:t>
       </w:r>
     </w:p>
     <w:p>
@@ -2767,8 +3204,19 @@
           <w:color w:val="1A1A1A"/>
           <w:sz w:val="20"/>
         </w:rPr>
-        <w:t xml:space="preserve">Shrink on purpose. </w:t>
+        <w:t xml:space="preserve">The German practice. </w:t>
       </w:r>
+      <w:hyperlink r:id="rId21">
+        <w:r>
+          <w:rPr>
+            <w:rFonts w:ascii="Calibri" w:hAnsi="Calibri"/>
+            <w:sz w:val="20"/>
+            <w:color w:val="2D6A4F"/>
+            <w:u w:val="single"/>
+          </w:rPr>
+          <w:t xml:space="preserve">Künstlersozialkasse, for writers</w:t>
+        </w:r>
+      </w:hyperlink>
       <w:r>
         <w:rPr>
           <w:rFonts w:ascii="Calibri" w:hAnsi="Calibri" w:eastAsia="Calibri"/>
@@ -2777,12 +3225,54 @@
           <w:color w:val="1A1A1A"/>
           <w:sz w:val="20"/>
         </w:rPr>
-        <w:t>Month 9 is when you design the four-day retainer and tell clients the calendar. That same offer is what you pick back up after the degree, while the therapy roster is still small. The two practices stay separate: different name, different site, different promise.</w:t>
+        <w:t xml:space="preserve">, </w:t>
+      </w:r>
+      <w:hyperlink r:id="rId22">
+        <w:r>
+          <w:rPr>
+            <w:rFonts w:ascii="Calibri" w:hAnsi="Calibri"/>
+            <w:sz w:val="20"/>
+            <w:color w:val="2D6A4F"/>
+            <w:u w:val="single"/>
+          </w:rPr>
+          <w:t xml:space="preserve">Kleinunternehmerregelung, §19 UStG</w:t>
+        </w:r>
+      </w:hyperlink>
+      <w:r>
+        <w:rPr>
+          <w:rFonts w:ascii="Calibri" w:hAnsi="Calibri" w:eastAsia="Calibri"/>
+          <w:b w:val="0"/>
+          <w:i w:val="0"/>
+          <w:color w:val="1A1A1A"/>
+          <w:sz w:val="20"/>
+        </w:rPr>
+        <w:t xml:space="preserve">, and </w:t>
+      </w:r>
+      <w:hyperlink r:id="rId23">
+        <w:r>
+          <w:rPr>
+            <w:rFonts w:ascii="Calibri" w:hAnsi="Calibri"/>
+            <w:sz w:val="20"/>
+            <w:color w:val="2D6A4F"/>
+            <w:u w:val="single"/>
+          </w:rPr>
+          <w:t xml:space="preserve">Freiberufler, §18 EStG</w:t>
+        </w:r>
+      </w:hyperlink>
+      <w:r>
+        <w:rPr>
+          <w:rFonts w:ascii="Calibri" w:hAnsi="Calibri" w:eastAsia="Calibri"/>
+          <w:b w:val="0"/>
+          <w:i w:val="0"/>
+          <w:color w:val="1A1A1A"/>
+          <w:sz w:val="20"/>
+        </w:rPr>
+        <w:t>.</w:t>
       </w:r>
     </w:p>
     <w:p>
       <w:pPr>
-        <w:spacing w:before="40" w:after="0" w:line="245" w:lineRule="auto"/>
+        <w:spacing w:before="20" w:after="0" w:line="245" w:lineRule="auto"/>
       </w:pPr>
       <w:r>
         <w:rPr>
@@ -2792,13 +3282,13 @@
           <w:color w:val="3D4A45"/>
           <w:sz w:val="16"/>
         </w:rPr>
-        <w:t>Planning note. Specialist rates cited from public pages as of early 2026: The EcoWriter (€85/hour; €3,000 for a 1,500–2,000 word sustainability article) and Renewable Writing (white papers from $6,000). German thresholds used here: Kleinunternehmer prior-year turnover under €25,000 and current-year under €100,000; KSK health-insurance contributions assessed from a 2026 minimum income of €7,910 a year, with the insured paying roughly half. The €5,200 figure is a planning estimate, not tax advice.</w:t>
+        <w:t>Planning note, not tax advice. Public rates used above, early 2026: The EcoWriter (€85/hour; €3,000 for a sustainability article) and Renewable Writing (white papers from $6,000). Kleinunternehmer: prior year under €25,000 and this year under €100,000. KSK’s 2026 health minimum is €7,910, and the insured pays about half.</w:t>
       </w:r>
     </w:p>
     <w:sectPr>
-      <w:footerReference w:type="default" r:id="rId9"/>
+      <w:footerReference w:type="default" r:id="rId24"/>
       <w:pgSz w:w="11906" w:h="16838"/>
-      <w:pgMar w:top="652" w:right="765" w:bottom="680" w:left="765" w:header="227" w:footer="227" w:gutter="0"/>
+      <w:pgMar w:top="595" w:right="765" w:bottom="595" w:left="765" w:header="227" w:footer="227" w:gutter="0"/>
       <w:cols w:space="720"/>
       <w:docGrid w:linePitch="360"/>
     </w:sectPr>

</xml_diff>